<commit_message>
Portal: CQ com 46 defeitos e 88 requisitos (casos F01 e F02, DV-CQ-046), premissas de simulação na Biblioteca, relatório de testes v1.2
Co-Authored-By: Claude Sonnet 5.5 <noreply@anthropic.com>
Claude-Session: https://claude.ai/code/session_016ZyaVQ3Fat8knNf78iQG9U
</commit_message>
<xml_diff>
--- a/documentacao/arquivos/controle-qualidade/LabMedSys - Modulo Controle da Qualidade - Fora do menu - Tela 01 Consultar Coletas Pendentes de Programação - Anvisa.docx
+++ b/documentacao/arquivos/controle-qualidade/LabMedSys - Modulo Controle da Qualidade - Fora do menu - Tela 01 Consultar Coletas Pendentes de Programação - Anvisa.docx
@@ -946,7 +946,7 @@
               <w:rPr>
                 <w:szCs w:val="20"/>
               </w:rPr>
-              <w:t>30/10/2026</w:t>
+              <w:t>31/10/2026</w:t>
             </w:r>
           </w:p>
         </w:tc>
@@ -3547,9 +3547,9 @@
         <w:tblLook w:val="04A0" w:firstRow="1" w:lastRow="0" w:firstColumn="1" w:lastColumn="0" w:noHBand="0" w:noVBand="1"/>
       </w:tblPr>
       <w:tblGrid>
-        <w:gridCol w:w="2292"/>
-        <w:gridCol w:w="1744"/>
-        <w:gridCol w:w="4366"/>
+        <w:gridCol w:w="2286"/>
+        <w:gridCol w:w="1741"/>
+        <w:gridCol w:w="4375"/>
         <w:gridCol w:w="1229"/>
       </w:tblGrid>
       <w:tr>
@@ -3559,7 +3559,7 @@
         </w:trPr>
         <w:tc>
           <w:tcPr>
-            <w:tcW w:w="2292" w:type="dxa"/>
+            <w:tcW w:w="2286" w:type="dxa"/>
             <w:shd w:val="clear" w:color="auto" w:fill="D9D9D9" w:themeFill="background1" w:themeFillShade="D9"/>
           </w:tcPr>
           <w:p>
@@ -3587,7 +3587,7 @@
         </w:tc>
         <w:tc>
           <w:tcPr>
-            <w:tcW w:w="1744" w:type="dxa"/>
+            <w:tcW w:w="1741" w:type="dxa"/>
             <w:shd w:val="clear" w:color="auto" w:fill="D9D9D9" w:themeFill="background1" w:themeFillShade="D9"/>
           </w:tcPr>
           <w:p>
@@ -3615,7 +3615,7 @@
         </w:tc>
         <w:tc>
           <w:tcPr>
-            <w:tcW w:w="4366" w:type="dxa"/>
+            <w:tcW w:w="4375" w:type="dxa"/>
             <w:shd w:val="clear" w:color="auto" w:fill="D9D9D9" w:themeFill="background1" w:themeFillShade="D9"/>
           </w:tcPr>
           <w:p>
@@ -3676,7 +3676,7 @@
         </w:trPr>
         <w:tc>
           <w:tcPr>
-            <w:tcW w:w="2292" w:type="dxa"/>
+            <w:tcW w:w="2286" w:type="dxa"/>
           </w:tcPr>
           <w:p>
             <w:pPr>
@@ -3699,7 +3699,7 @@
         </w:tc>
         <w:tc>
           <w:tcPr>
-            <w:tcW w:w="1744" w:type="dxa"/>
+            <w:tcW w:w="1741" w:type="dxa"/>
           </w:tcPr>
           <w:p>
             <w:pPr>
@@ -3722,7 +3722,7 @@
         </w:tc>
         <w:tc>
           <w:tcPr>
-            <w:tcW w:w="4366" w:type="dxa"/>
+            <w:tcW w:w="4375" w:type="dxa"/>
           </w:tcPr>
           <w:p>
             <w:pPr>
@@ -3801,7 +3801,7 @@
         </w:trPr>
         <w:tc>
           <w:tcPr>
-            <w:tcW w:w="2292" w:type="dxa"/>
+            <w:tcW w:w="2286" w:type="dxa"/>
           </w:tcPr>
           <w:p>
             <w:pPr>
@@ -3824,7 +3824,7 @@
         </w:tc>
         <w:tc>
           <w:tcPr>
-            <w:tcW w:w="1744" w:type="dxa"/>
+            <w:tcW w:w="1741" w:type="dxa"/>
           </w:tcPr>
           <w:p>
             <w:pPr>
@@ -3847,7 +3847,7 @@
         </w:tc>
         <w:tc>
           <w:tcPr>
-            <w:tcW w:w="4366" w:type="dxa"/>
+            <w:tcW w:w="4375" w:type="dxa"/>
           </w:tcPr>
           <w:p>
             <w:pPr>
@@ -3928,7 +3928,7 @@
         </w:trPr>
         <w:tc>
           <w:tcPr>
-            <w:tcW w:w="2292" w:type="dxa"/>
+            <w:tcW w:w="2286" w:type="dxa"/>
           </w:tcPr>
           <w:p>
             <w:pPr>
@@ -3951,7 +3951,7 @@
         </w:tc>
         <w:tc>
           <w:tcPr>
-            <w:tcW w:w="1744" w:type="dxa"/>
+            <w:tcW w:w="1741" w:type="dxa"/>
           </w:tcPr>
           <w:p>
             <w:pPr>
@@ -3974,7 +3974,7 @@
         </w:tc>
         <w:tc>
           <w:tcPr>
-            <w:tcW w:w="4366" w:type="dxa"/>
+            <w:tcW w:w="4375" w:type="dxa"/>
           </w:tcPr>
           <w:p>
             <w:pPr>
@@ -4039,7 +4039,7 @@
         </w:trPr>
         <w:tc>
           <w:tcPr>
-            <w:tcW w:w="2292" w:type="dxa"/>
+            <w:tcW w:w="2286" w:type="dxa"/>
           </w:tcPr>
           <w:p>
             <w:pPr>
@@ -4062,7 +4062,7 @@
         </w:tc>
         <w:tc>
           <w:tcPr>
-            <w:tcW w:w="1744" w:type="dxa"/>
+            <w:tcW w:w="1741" w:type="dxa"/>
           </w:tcPr>
           <w:p>
             <w:pPr>
@@ -4085,7 +4085,7 @@
         </w:tc>
         <w:tc>
           <w:tcPr>
-            <w:tcW w:w="4366" w:type="dxa"/>
+            <w:tcW w:w="4375" w:type="dxa"/>
           </w:tcPr>
           <w:p>
             <w:pPr>
@@ -4102,7 +4102,7 @@
                 <w:sz w:val="18"/>
                 <w:szCs w:val="20"/>
               </w:rPr>
-              <w:t xml:space="preserve">O endereço desta tela nunca foi pedido ao ambiente. Os endereços vizinhos que não existem (Consultar Solicitações, </w:t>
+              <w:t xml:space="preserve">Os três caminhos possíveis desta tela responderam HTTP 404 em 31/10/2026 (CT-CQ-F01-01). Os endereços vizinhos que não existem (Consultar Solicitações, </w:t>
             </w:r>
             <w:r>
               <w:rPr>

</xml_diff>